<commit_message>
Fitur variasi user 200-1000 (durasi tetap 5m) + runner run-all.js + DOCX placeholder
</commit_message>
<xml_diff>
--- a/Laporan_DABD_Kelompok1.docx
+++ b/Laporan_DABD_Kelompok1.docx
@@ -173,7 +173,7 @@
         <w:pStyle w:val="ListBullet"/>
       </w:pPr>
       <w:r>
-        <w:t>Beban: ramp-up 1 → 50 → 100 → 200 VU, durasi 90 detik.</w:t>
+        <w:t>Model beban: jumlah user KONSTAN per run, bervariasi antar run — level user kelipatan 200 (200, 400, 600, 800, 1000), durasi tetap 5 menit tiap run.</w:t>
       </w:r>
     </w:p>
     <w:p>
@@ -181,7 +181,15 @@
         <w:pStyle w:val="ListBullet"/>
       </w:pPr>
       <w:r>
-        <w:t>File uji: 1kb, 10kb, 100kb, 1000kb (1MB), 10000kb (10MB). Error rate 0% pada semua skenario.</w:t>
+        <w:t>File uji: 1kb, 10kb, 100kb, 1000kb (1MB), 10000kb (10MB). Dijalankan via skrip tests/run-all.js.</w:t>
+      </w:r>
+    </w:p>
+    <w:p>
+      <w:pPr>
+        <w:pStyle w:val="ListBullet"/>
+      </w:pPr>
+      <w:r>
+        <w:t>Hasil angka konkret: TBD — diisi setelah pengujian aktual dijalankan.</w:t>
       </w:r>
     </w:p>
     <w:p>
@@ -269,6 +277,14 @@
       </w:r>
     </w:p>
     <w:p>
+      <w:pPr>
+        <w:pStyle w:val="ListBullet"/>
+      </w:pPr>
+      <w:r>
+        <w:t>Variasi: 5 level user (200–1000, durasi tetap 5 menit) × 5 ukuran file; hasil per run di tests/tugas1-{file}-vu{VUS}.json.</w:t>
+      </w:r>
+    </w:p>
+    <w:p>
       <w:r>
         <w:rPr>
           <w:b w:val="0"/>
@@ -312,6 +328,15 @@
         <w:t>2.3 Hasil Benchmark</w:t>
       </w:r>
     </w:p>
+    <w:p>
+      <w:r>
+        <w:rPr>
+          <w:b w:val="0"/>
+          <w:i/>
+        </w:rPr>
+        <w:t>Hasil diisi setelah pengujian aktual dijalankan. Pola tabel: untuk tiap ukuran file, nilai latency (avg/p90/p95) dan throughput pada tiap level user (200, 400, 600, 800, 1000).</w:t>
+      </w:r>
+    </w:p>
     <w:tbl>
       <w:tblPr>
         <w:tblStyle w:val="LightGrid-Accent1"/>
@@ -320,16 +345,17 @@
         <w:tblLook w:firstColumn="1" w:firstRow="1" w:lastColumn="0" w:lastRow="0" w:noHBand="0" w:noVBand="1" w:val="04A0"/>
       </w:tblPr>
       <w:tblGrid>
-        <w:gridCol w:w="1824"/>
-        <w:gridCol w:w="1824"/>
-        <w:gridCol w:w="1824"/>
-        <w:gridCol w:w="1824"/>
-        <w:gridCol w:w="1824"/>
+        <w:gridCol w:w="1520"/>
+        <w:gridCol w:w="1520"/>
+        <w:gridCol w:w="1520"/>
+        <w:gridCol w:w="1520"/>
+        <w:gridCol w:w="1520"/>
+        <w:gridCol w:w="1520"/>
       </w:tblGrid>
       <w:tr>
         <w:tc>
           <w:tcPr>
-            <w:tcW w:type="dxa" w:w="1824"/>
+            <w:tcW w:type="dxa" w:w="1520"/>
             <w:shd w:val="clear" w:color="auto" w:fill="1F4E79"/>
           </w:tcPr>
           <w:p>
@@ -349,7 +375,27 @@
         </w:tc>
         <w:tc>
           <w:tcPr>
-            <w:tcW w:type="dxa" w:w="1824"/>
+            <w:tcW w:type="dxa" w:w="1520"/>
+            <w:shd w:val="clear" w:color="auto" w:fill="1F4E79"/>
+          </w:tcPr>
+          <w:p>
+            <w:pPr>
+              <w:jc w:val="center"/>
+            </w:pPr>
+            <w:r/>
+            <w:r>
+              <w:rPr>
+                <w:b/>
+                <w:color w:val="FFFFFF"/>
+                <w:sz w:val="20"/>
+              </w:rPr>
+              <w:t>Level User</w:t>
+            </w:r>
+          </w:p>
+        </w:tc>
+        <w:tc>
+          <w:tcPr>
+            <w:tcW w:type="dxa" w:w="1520"/>
             <w:shd w:val="clear" w:color="auto" w:fill="1F4E79"/>
           </w:tcPr>
           <w:p>
@@ -369,7 +415,7 @@
         </w:tc>
         <w:tc>
           <w:tcPr>
-            <w:tcW w:type="dxa" w:w="1824"/>
+            <w:tcW w:type="dxa" w:w="1520"/>
             <w:shd w:val="clear" w:color="auto" w:fill="1F4E79"/>
           </w:tcPr>
           <w:p>
@@ -389,7 +435,7 @@
         </w:tc>
         <w:tc>
           <w:tcPr>
-            <w:tcW w:type="dxa" w:w="1824"/>
+            <w:tcW w:type="dxa" w:w="1520"/>
             <w:shd w:val="clear" w:color="auto" w:fill="1F4E79"/>
           </w:tcPr>
           <w:p>
@@ -409,7 +455,7 @@
         </w:tc>
         <w:tc>
           <w:tcPr>
-            <w:tcW w:type="dxa" w:w="1824"/>
+            <w:tcW w:type="dxa" w:w="1520"/>
             <w:shd w:val="clear" w:color="auto" w:fill="1F4E79"/>
           </w:tcPr>
           <w:p>
@@ -431,7 +477,7 @@
       <w:tr>
         <w:tc>
           <w:tcPr>
-            <w:tcW w:type="dxa" w:w="1824"/>
+            <w:tcW w:type="dxa" w:w="1520"/>
           </w:tcPr>
           <w:p>
             <w:pPr>
@@ -449,7 +495,7 @@
         </w:tc>
         <w:tc>
           <w:tcPr>
-            <w:tcW w:type="dxa" w:w="1824"/>
+            <w:tcW w:type="dxa" w:w="1520"/>
           </w:tcPr>
           <w:p>
             <w:pPr>
@@ -460,13 +506,13 @@
               <w:rPr>
                 <w:sz w:val="20"/>
               </w:rPr>
-              <w:t>62.57</w:t>
+              <w:t>200–1000</w:t>
             </w:r>
           </w:p>
         </w:tc>
         <w:tc>
           <w:tcPr>
-            <w:tcW w:type="dxa" w:w="1824"/>
+            <w:tcW w:type="dxa" w:w="1520"/>
           </w:tcPr>
           <w:p>
             <w:pPr>
@@ -477,13 +523,13 @@
               <w:rPr>
                 <w:sz w:val="20"/>
               </w:rPr>
-              <w:t>67.24</w:t>
+              <w:t>TBD</w:t>
             </w:r>
           </w:p>
         </w:tc>
         <w:tc>
           <w:tcPr>
-            <w:tcW w:type="dxa" w:w="1824"/>
+            <w:tcW w:type="dxa" w:w="1520"/>
           </w:tcPr>
           <w:p>
             <w:pPr>
@@ -494,13 +540,13 @@
               <w:rPr>
                 <w:sz w:val="20"/>
               </w:rPr>
-              <w:t>2,664.21</w:t>
+              <w:t>TBD</w:t>
             </w:r>
           </w:p>
         </w:tc>
         <w:tc>
           <w:tcPr>
-            <w:tcW w:type="dxa" w:w="1824"/>
+            <w:tcW w:type="dxa" w:w="1520"/>
           </w:tcPr>
           <w:p>
             <w:pPr>
@@ -511,7 +557,24 @@
               <w:rPr>
                 <w:sz w:val="20"/>
               </w:rPr>
-              <w:t>239,780</w:t>
+              <w:t>TBD</w:t>
+            </w:r>
+          </w:p>
+        </w:tc>
+        <w:tc>
+          <w:tcPr>
+            <w:tcW w:type="dxa" w:w="1520"/>
+          </w:tcPr>
+          <w:p>
+            <w:pPr>
+              <w:jc w:val="center"/>
+            </w:pPr>
+            <w:r/>
+            <w:r>
+              <w:rPr>
+                <w:sz w:val="20"/>
+              </w:rPr>
+              <w:t>TBD</w:t>
             </w:r>
           </w:p>
         </w:tc>
@@ -519,7 +582,7 @@
       <w:tr>
         <w:tc>
           <w:tcPr>
-            <w:tcW w:type="dxa" w:w="1824"/>
+            <w:tcW w:type="dxa" w:w="1520"/>
           </w:tcPr>
           <w:p>
             <w:pPr>
@@ -537,7 +600,7 @@
         </w:tc>
         <w:tc>
           <w:tcPr>
-            <w:tcW w:type="dxa" w:w="1824"/>
+            <w:tcW w:type="dxa" w:w="1520"/>
           </w:tcPr>
           <w:p>
             <w:pPr>
@@ -548,13 +611,13 @@
               <w:rPr>
                 <w:sz w:val="20"/>
               </w:rPr>
-              <w:t>73.60</w:t>
+              <w:t>200–1000</w:t>
             </w:r>
           </w:p>
         </w:tc>
         <w:tc>
           <w:tcPr>
-            <w:tcW w:type="dxa" w:w="1824"/>
+            <w:tcW w:type="dxa" w:w="1520"/>
           </w:tcPr>
           <w:p>
             <w:pPr>
@@ -565,13 +628,13 @@
               <w:rPr>
                 <w:sz w:val="20"/>
               </w:rPr>
-              <w:t>89.63</w:t>
+              <w:t>TBD</w:t>
             </w:r>
           </w:p>
         </w:tc>
         <w:tc>
           <w:tcPr>
-            <w:tcW w:type="dxa" w:w="1824"/>
+            <w:tcW w:type="dxa" w:w="1520"/>
           </w:tcPr>
           <w:p>
             <w:pPr>
@@ -582,13 +645,13 @@
               <w:rPr>
                 <w:sz w:val="20"/>
               </w:rPr>
-              <w:t>2,364.32</w:t>
+              <w:t>TBD</w:t>
             </w:r>
           </w:p>
         </w:tc>
         <w:tc>
           <w:tcPr>
-            <w:tcW w:type="dxa" w:w="1824"/>
+            <w:tcW w:type="dxa" w:w="1520"/>
           </w:tcPr>
           <w:p>
             <w:pPr>
@@ -599,7 +662,24 @@
               <w:rPr>
                 <w:sz w:val="20"/>
               </w:rPr>
-              <w:t>212,792</w:t>
+              <w:t>TBD</w:t>
+            </w:r>
+          </w:p>
+        </w:tc>
+        <w:tc>
+          <w:tcPr>
+            <w:tcW w:type="dxa" w:w="1520"/>
+          </w:tcPr>
+          <w:p>
+            <w:pPr>
+              <w:jc w:val="center"/>
+            </w:pPr>
+            <w:r/>
+            <w:r>
+              <w:rPr>
+                <w:sz w:val="20"/>
+              </w:rPr>
+              <w:t>TBD</w:t>
             </w:r>
           </w:p>
         </w:tc>
@@ -607,7 +687,7 @@
       <w:tr>
         <w:tc>
           <w:tcPr>
-            <w:tcW w:type="dxa" w:w="1824"/>
+            <w:tcW w:type="dxa" w:w="1520"/>
           </w:tcPr>
           <w:p>
             <w:pPr>
@@ -625,7 +705,7 @@
         </w:tc>
         <w:tc>
           <w:tcPr>
-            <w:tcW w:type="dxa" w:w="1824"/>
+            <w:tcW w:type="dxa" w:w="1520"/>
           </w:tcPr>
           <w:p>
             <w:pPr>
@@ -636,13 +716,13 @@
               <w:rPr>
                 <w:sz w:val="20"/>
               </w:rPr>
-              <w:t>171.83</w:t>
+              <w:t>200–1000</w:t>
             </w:r>
           </w:p>
         </w:tc>
         <w:tc>
           <w:tcPr>
-            <w:tcW w:type="dxa" w:w="1824"/>
+            <w:tcW w:type="dxa" w:w="1520"/>
           </w:tcPr>
           <w:p>
             <w:pPr>
@@ -653,13 +733,13 @@
               <w:rPr>
                 <w:sz w:val="20"/>
               </w:rPr>
-              <w:t>188.95</w:t>
+              <w:t>TBD</w:t>
             </w:r>
           </w:p>
         </w:tc>
         <w:tc>
           <w:tcPr>
-            <w:tcW w:type="dxa" w:w="1824"/>
+            <w:tcW w:type="dxa" w:w="1520"/>
           </w:tcPr>
           <w:p>
             <w:pPr>
@@ -670,13 +750,13 @@
               <w:rPr>
                 <w:sz w:val="20"/>
               </w:rPr>
-              <w:t>1,031.11</w:t>
+              <w:t>TBD</w:t>
             </w:r>
           </w:p>
         </w:tc>
         <w:tc>
           <w:tcPr>
-            <w:tcW w:type="dxa" w:w="1824"/>
+            <w:tcW w:type="dxa" w:w="1520"/>
           </w:tcPr>
           <w:p>
             <w:pPr>
@@ -687,7 +767,24 @@
               <w:rPr>
                 <w:sz w:val="20"/>
               </w:rPr>
-              <w:t>92,804</w:t>
+              <w:t>TBD</w:t>
+            </w:r>
+          </w:p>
+        </w:tc>
+        <w:tc>
+          <w:tcPr>
+            <w:tcW w:type="dxa" w:w="1520"/>
+          </w:tcPr>
+          <w:p>
+            <w:pPr>
+              <w:jc w:val="center"/>
+            </w:pPr>
+            <w:r/>
+            <w:r>
+              <w:rPr>
+                <w:sz w:val="20"/>
+              </w:rPr>
+              <w:t>TBD</w:t>
             </w:r>
           </w:p>
         </w:tc>
@@ -695,7 +792,7 @@
       <w:tr>
         <w:tc>
           <w:tcPr>
-            <w:tcW w:type="dxa" w:w="1824"/>
+            <w:tcW w:type="dxa" w:w="1520"/>
           </w:tcPr>
           <w:p>
             <w:pPr>
@@ -713,7 +810,7 @@
         </w:tc>
         <w:tc>
           <w:tcPr>
-            <w:tcW w:type="dxa" w:w="1824"/>
+            <w:tcW w:type="dxa" w:w="1520"/>
           </w:tcPr>
           <w:p>
             <w:pPr>
@@ -724,13 +821,13 @@
               <w:rPr>
                 <w:sz w:val="20"/>
               </w:rPr>
-              <w:t>1,375.75</w:t>
+              <w:t>200–1000</w:t>
             </w:r>
           </w:p>
         </w:tc>
         <w:tc>
           <w:tcPr>
-            <w:tcW w:type="dxa" w:w="1824"/>
+            <w:tcW w:type="dxa" w:w="1520"/>
           </w:tcPr>
           <w:p>
             <w:pPr>
@@ -741,13 +838,13 @@
               <w:rPr>
                 <w:sz w:val="20"/>
               </w:rPr>
-              <w:t>1,510.97</w:t>
+              <w:t>TBD</w:t>
             </w:r>
           </w:p>
         </w:tc>
         <w:tc>
           <w:tcPr>
-            <w:tcW w:type="dxa" w:w="1824"/>
+            <w:tcW w:type="dxa" w:w="1520"/>
           </w:tcPr>
           <w:p>
             <w:pPr>
@@ -758,13 +855,13 @@
               <w:rPr>
                 <w:sz w:val="20"/>
               </w:rPr>
-              <w:t>131.85</w:t>
+              <w:t>TBD</w:t>
             </w:r>
           </w:p>
         </w:tc>
         <w:tc>
           <w:tcPr>
-            <w:tcW w:type="dxa" w:w="1824"/>
+            <w:tcW w:type="dxa" w:w="1520"/>
           </w:tcPr>
           <w:p>
             <w:pPr>
@@ -775,7 +872,24 @@
               <w:rPr>
                 <w:sz w:val="20"/>
               </w:rPr>
-              <w:t>11,868</w:t>
+              <w:t>TBD</w:t>
+            </w:r>
+          </w:p>
+        </w:tc>
+        <w:tc>
+          <w:tcPr>
+            <w:tcW w:type="dxa" w:w="1520"/>
+          </w:tcPr>
+          <w:p>
+            <w:pPr>
+              <w:jc w:val="center"/>
+            </w:pPr>
+            <w:r/>
+            <w:r>
+              <w:rPr>
+                <w:sz w:val="20"/>
+              </w:rPr>
+              <w:t>TBD</w:t>
             </w:r>
           </w:p>
         </w:tc>
@@ -783,7 +897,7 @@
       <w:tr>
         <w:tc>
           <w:tcPr>
-            <w:tcW w:type="dxa" w:w="1824"/>
+            <w:tcW w:type="dxa" w:w="1520"/>
           </w:tcPr>
           <w:p>
             <w:pPr>
@@ -801,7 +915,7 @@
         </w:tc>
         <w:tc>
           <w:tcPr>
-            <w:tcW w:type="dxa" w:w="1824"/>
+            <w:tcW w:type="dxa" w:w="1520"/>
           </w:tcPr>
           <w:p>
             <w:pPr>
@@ -812,13 +926,13 @@
               <w:rPr>
                 <w:sz w:val="20"/>
               </w:rPr>
-              <w:t>15,439.96</w:t>
+              <w:t>200–1000</w:t>
             </w:r>
           </w:p>
         </w:tc>
         <w:tc>
           <w:tcPr>
-            <w:tcW w:type="dxa" w:w="1824"/>
+            <w:tcW w:type="dxa" w:w="1520"/>
           </w:tcPr>
           <w:p>
             <w:pPr>
@@ -829,13 +943,13 @@
               <w:rPr>
                 <w:sz w:val="20"/>
               </w:rPr>
-              <w:t>15,955.10</w:t>
+              <w:t>TBD</w:t>
             </w:r>
           </w:p>
         </w:tc>
         <w:tc>
           <w:tcPr>
-            <w:tcW w:type="dxa" w:w="1824"/>
+            <w:tcW w:type="dxa" w:w="1520"/>
           </w:tcPr>
           <w:p>
             <w:pPr>
@@ -846,13 +960,13 @@
               <w:rPr>
                 <w:sz w:val="20"/>
               </w:rPr>
-              <w:t>11.32</w:t>
+              <w:t>TBD</w:t>
             </w:r>
           </w:p>
         </w:tc>
         <w:tc>
           <w:tcPr>
-            <w:tcW w:type="dxa" w:w="1824"/>
+            <w:tcW w:type="dxa" w:w="1520"/>
           </w:tcPr>
           <w:p>
             <w:pPr>
@@ -863,7 +977,24 @@
               <w:rPr>
                 <w:sz w:val="20"/>
               </w:rPr>
-              <w:t>1,040</w:t>
+              <w:t>TBD</w:t>
+            </w:r>
+          </w:p>
+        </w:tc>
+        <w:tc>
+          <w:tcPr>
+            <w:tcW w:type="dxa" w:w="1520"/>
+          </w:tcPr>
+          <w:p>
+            <w:pPr>
+              <w:jc w:val="center"/>
+            </w:pPr>
+            <w:r/>
+            <w:r>
+              <w:rPr>
+                <w:sz w:val="20"/>
+              </w:rPr>
+              <w:t>TBD</w:t>
             </w:r>
           </w:p>
         </w:tc>
@@ -878,7 +1009,7 @@
           <w:i/>
           <w:sz w:val="18"/>
         </w:rPr>
-        <w:t>Tabel 1. Hasil load test Tugas 1 (error rate 0%)</w:t>
+        <w:t>Tabel 1. Hasil load test Tugas 1 per level user (placeholder — diisi setelah tes)</w:t>
       </w:r>
     </w:p>
     <w:p>
@@ -893,11 +1024,12 @@
       </w:r>
     </w:p>
     <w:p>
-      <w:pPr>
-        <w:pStyle w:val="ListBullet"/>
-      </w:pPr>
       <w:r>
-        <w:t>File 1KB: latency rendah → throughput 2,664 req/s (server stabil).</w:t>
+        <w:rPr>
+          <w:b w:val="0"/>
+          <w:i w:val="0"/>
+        </w:rPr>
+        <w:t>Kerangka analisis (analog dengan logika Little's Law):</w:t>
       </w:r>
     </w:p>
     <w:p>
@@ -905,16 +1037,32 @@
         <w:pStyle w:val="ListBullet"/>
       </w:pPr>
       <w:r>
-        <w:t>File 10MB: latency p90 15,4 detik → throughput hanya 11 req/s.</w:t>
+        <w:t>Pada level user rendah (200): latency kecil → throughput tinggi (server belum jenuh).</w:t>
+      </w:r>
+    </w:p>
+    <w:p>
+      <w:pPr>
+        <w:pStyle w:val="ListBullet"/>
+      </w:pPr>
+      <w:r>
+        <w:t>Seiring user naik (400→1000): latency bertambah (delay/antrian) → throughput cenderung jenuh/menurun.</w:t>
+      </w:r>
+    </w:p>
+    <w:p>
+      <w:pPr>
+        <w:pStyle w:val="ListBullet"/>
+      </w:pPr>
+      <w:r>
+        <w:t>File besar (10MB): latency jauh lebih tinggi dibanding file kecil pada level user yang sama.</w:t>
       </w:r>
     </w:p>
     <w:p>
       <w:r>
         <w:rPr>
           <w:b w:val="0"/>
-          <w:i w:val="0"/>
+          <w:i/>
         </w:rPr>
-        <w:t>File besar → W membengkak → L membesar → server jenuh → λ turun drastis.</w:t>
+        <w:t>Angka kuantitatif: TBD — diisi setelah pengujian aktual.</w:t>
       </w:r>
     </w:p>
     <w:p>
@@ -934,7 +1082,7 @@
           <w:b w:val="0"/>
           <w:i w:val="0"/>
         </w:rPr>
-        <w:t>Little's Law terbukti. Melonjak dari 1KB ke 10MB menurunkan throughput hingga 99,6% (2.664 → 11 req/s). Server tunggal memiliki batas mutlak kapasitas.</w:t>
+        <w:t>Little's Law akan dibuktikan dari pola L = λ × W: bertambahnya jumlah user (L) menaikkan latency (W); pada file besar, W membengkak sehingga λ turun drastis. Kesimpulan angka konkret diisi setelah tes.</w:t>
       </w:r>
     </w:p>
     <w:p>
@@ -1030,6 +1178,14 @@
       </w:r>
     </w:p>
     <w:p>
+      <w:pPr>
+        <w:pStyle w:val="ListBullet"/>
+      </w:pPr>
+      <w:r>
+        <w:t>Variasi: 5 level user (200–1000, durasi tetap 5 menit) × 5 ukuran file; hasil di tests/tugas2-{file}-vu{VUS}.json.</w:t>
+      </w:r>
+    </w:p>
+    <w:p>
       <w:r>
         <w:rPr>
           <w:b w:val="0"/>
@@ -1083,6 +1239,395 @@
         <w:t>3.3 Hasil Benchmark</w:t>
       </w:r>
     </w:p>
+    <w:p>
+      <w:r>
+        <w:rPr>
+          <w:b w:val="0"/>
+          <w:i/>
+        </w:rPr>
+        <w:t>Hasil per level user (200–1000) untuk T1 dan T2, diisi setelah pengujian aktual.</w:t>
+      </w:r>
+    </w:p>
+    <w:tbl>
+      <w:tblPr>
+        <w:tblStyle w:val="LightGrid-Accent1"/>
+        <w:tblW w:type="auto" w:w="0"/>
+        <w:jc w:val="center"/>
+        <w:tblLook w:firstColumn="1" w:firstRow="1" w:lastColumn="0" w:lastRow="0" w:noHBand="0" w:noVBand="1" w:val="04A0"/>
+      </w:tblPr>
+      <w:tblGrid>
+        <w:gridCol w:w="1520"/>
+        <w:gridCol w:w="1520"/>
+        <w:gridCol w:w="1520"/>
+        <w:gridCol w:w="1520"/>
+        <w:gridCol w:w="1520"/>
+        <w:gridCol w:w="1520"/>
+      </w:tblGrid>
+      <w:tr>
+        <w:tc>
+          <w:tcPr>
+            <w:tcW w:type="dxa" w:w="1520"/>
+            <w:shd w:val="clear" w:color="auto" w:fill="1F4E79"/>
+          </w:tcPr>
+          <w:p>
+            <w:pPr>
+              <w:jc w:val="center"/>
+            </w:pPr>
+            <w:r/>
+            <w:r>
+              <w:rPr>
+                <w:b/>
+                <w:color w:val="FFFFFF"/>
+                <w:sz w:val="20"/>
+              </w:rPr>
+              <w:t>Skenario</w:t>
+            </w:r>
+          </w:p>
+        </w:tc>
+        <w:tc>
+          <w:tcPr>
+            <w:tcW w:type="dxa" w:w="1520"/>
+            <w:shd w:val="clear" w:color="auto" w:fill="1F4E79"/>
+          </w:tcPr>
+          <w:p>
+            <w:pPr>
+              <w:jc w:val="center"/>
+            </w:pPr>
+            <w:r/>
+            <w:r>
+              <w:rPr>
+                <w:b/>
+                <w:color w:val="FFFFFF"/>
+                <w:sz w:val="20"/>
+              </w:rPr>
+              <w:t>Level User</w:t>
+            </w:r>
+          </w:p>
+        </w:tc>
+        <w:tc>
+          <w:tcPr>
+            <w:tcW w:type="dxa" w:w="1520"/>
+            <w:shd w:val="clear" w:color="auto" w:fill="1F4E79"/>
+          </w:tcPr>
+          <w:p>
+            <w:pPr>
+              <w:jc w:val="center"/>
+            </w:pPr>
+            <w:r/>
+            <w:r>
+              <w:rPr>
+                <w:b/>
+                <w:color w:val="FFFFFF"/>
+                <w:sz w:val="20"/>
+              </w:rPr>
+              <w:t>p90 (ms)</w:t>
+            </w:r>
+          </w:p>
+        </w:tc>
+        <w:tc>
+          <w:tcPr>
+            <w:tcW w:type="dxa" w:w="1520"/>
+            <w:shd w:val="clear" w:color="auto" w:fill="1F4E79"/>
+          </w:tcPr>
+          <w:p>
+            <w:pPr>
+              <w:jc w:val="center"/>
+            </w:pPr>
+            <w:r/>
+            <w:r>
+              <w:rPr>
+                <w:b/>
+                <w:color w:val="FFFFFF"/>
+                <w:sz w:val="20"/>
+              </w:rPr>
+              <w:t>p95 (ms)</w:t>
+            </w:r>
+          </w:p>
+        </w:tc>
+        <w:tc>
+          <w:tcPr>
+            <w:tcW w:type="dxa" w:w="1520"/>
+            <w:shd w:val="clear" w:color="auto" w:fill="1F4E79"/>
+          </w:tcPr>
+          <w:p>
+            <w:pPr>
+              <w:jc w:val="center"/>
+            </w:pPr>
+            <w:r/>
+            <w:r>
+              <w:rPr>
+                <w:b/>
+                <w:color w:val="FFFFFF"/>
+                <w:sz w:val="20"/>
+              </w:rPr>
+              <w:t>Throughput (req/s)</w:t>
+            </w:r>
+          </w:p>
+        </w:tc>
+        <w:tc>
+          <w:tcPr>
+            <w:tcW w:type="dxa" w:w="1520"/>
+            <w:shd w:val="clear" w:color="auto" w:fill="1F4E79"/>
+          </w:tcPr>
+          <w:p>
+            <w:pPr>
+              <w:jc w:val="center"/>
+            </w:pPr>
+            <w:r/>
+            <w:r>
+              <w:rPr>
+                <w:b/>
+                <w:color w:val="FFFFFF"/>
+                <w:sz w:val="20"/>
+              </w:rPr>
+              <w:t>Total Request</w:t>
+            </w:r>
+          </w:p>
+        </w:tc>
+      </w:tr>
+      <w:tr>
+        <w:tc>
+          <w:tcPr>
+            <w:tcW w:type="dxa" w:w="1520"/>
+          </w:tcPr>
+          <w:p>
+            <w:pPr>
+              <w:jc w:val="center"/>
+            </w:pPr>
+            <w:r/>
+            <w:r>
+              <w:rPr>
+                <w:b/>
+                <w:sz w:val="20"/>
+              </w:rPr>
+              <w:t>T1 (1 node)</w:t>
+            </w:r>
+          </w:p>
+        </w:tc>
+        <w:tc>
+          <w:tcPr>
+            <w:tcW w:type="dxa" w:w="1520"/>
+          </w:tcPr>
+          <w:p>
+            <w:pPr>
+              <w:jc w:val="center"/>
+            </w:pPr>
+            <w:r/>
+            <w:r>
+              <w:rPr>
+                <w:sz w:val="20"/>
+              </w:rPr>
+              <w:t>200–1000</w:t>
+            </w:r>
+          </w:p>
+        </w:tc>
+        <w:tc>
+          <w:tcPr>
+            <w:tcW w:type="dxa" w:w="1520"/>
+          </w:tcPr>
+          <w:p>
+            <w:pPr>
+              <w:jc w:val="center"/>
+            </w:pPr>
+            <w:r/>
+            <w:r>
+              <w:rPr>
+                <w:sz w:val="20"/>
+              </w:rPr>
+              <w:t>TBD</w:t>
+            </w:r>
+          </w:p>
+        </w:tc>
+        <w:tc>
+          <w:tcPr>
+            <w:tcW w:type="dxa" w:w="1520"/>
+          </w:tcPr>
+          <w:p>
+            <w:pPr>
+              <w:jc w:val="center"/>
+            </w:pPr>
+            <w:r/>
+            <w:r>
+              <w:rPr>
+                <w:sz w:val="20"/>
+              </w:rPr>
+              <w:t>TBD</w:t>
+            </w:r>
+          </w:p>
+        </w:tc>
+        <w:tc>
+          <w:tcPr>
+            <w:tcW w:type="dxa" w:w="1520"/>
+          </w:tcPr>
+          <w:p>
+            <w:pPr>
+              <w:jc w:val="center"/>
+            </w:pPr>
+            <w:r/>
+            <w:r>
+              <w:rPr>
+                <w:sz w:val="20"/>
+              </w:rPr>
+              <w:t>TBD</w:t>
+            </w:r>
+          </w:p>
+        </w:tc>
+        <w:tc>
+          <w:tcPr>
+            <w:tcW w:type="dxa" w:w="1520"/>
+          </w:tcPr>
+          <w:p>
+            <w:pPr>
+              <w:jc w:val="center"/>
+            </w:pPr>
+            <w:r/>
+            <w:r>
+              <w:rPr>
+                <w:sz w:val="20"/>
+              </w:rPr>
+              <w:t>TBD</w:t>
+            </w:r>
+          </w:p>
+        </w:tc>
+      </w:tr>
+      <w:tr>
+        <w:tc>
+          <w:tcPr>
+            <w:tcW w:type="dxa" w:w="1520"/>
+          </w:tcPr>
+          <w:p>
+            <w:pPr>
+              <w:jc w:val="center"/>
+            </w:pPr>
+            <w:r/>
+            <w:r>
+              <w:rPr>
+                <w:b/>
+                <w:sz w:val="20"/>
+              </w:rPr>
+              <w:t>T2 (3 node+LB)</w:t>
+            </w:r>
+          </w:p>
+        </w:tc>
+        <w:tc>
+          <w:tcPr>
+            <w:tcW w:type="dxa" w:w="1520"/>
+          </w:tcPr>
+          <w:p>
+            <w:pPr>
+              <w:jc w:val="center"/>
+            </w:pPr>
+            <w:r/>
+            <w:r>
+              <w:rPr>
+                <w:sz w:val="20"/>
+              </w:rPr>
+              <w:t>200–1000</w:t>
+            </w:r>
+          </w:p>
+        </w:tc>
+        <w:tc>
+          <w:tcPr>
+            <w:tcW w:type="dxa" w:w="1520"/>
+          </w:tcPr>
+          <w:p>
+            <w:pPr>
+              <w:jc w:val="center"/>
+            </w:pPr>
+            <w:r/>
+            <w:r>
+              <w:rPr>
+                <w:sz w:val="20"/>
+              </w:rPr>
+              <w:t>TBD</w:t>
+            </w:r>
+          </w:p>
+        </w:tc>
+        <w:tc>
+          <w:tcPr>
+            <w:tcW w:type="dxa" w:w="1520"/>
+          </w:tcPr>
+          <w:p>
+            <w:pPr>
+              <w:jc w:val="center"/>
+            </w:pPr>
+            <w:r/>
+            <w:r>
+              <w:rPr>
+                <w:sz w:val="20"/>
+              </w:rPr>
+              <w:t>TBD</w:t>
+            </w:r>
+          </w:p>
+        </w:tc>
+        <w:tc>
+          <w:tcPr>
+            <w:tcW w:type="dxa" w:w="1520"/>
+          </w:tcPr>
+          <w:p>
+            <w:pPr>
+              <w:jc w:val="center"/>
+            </w:pPr>
+            <w:r/>
+            <w:r>
+              <w:rPr>
+                <w:sz w:val="20"/>
+              </w:rPr>
+              <w:t>TBD</w:t>
+            </w:r>
+          </w:p>
+        </w:tc>
+        <w:tc>
+          <w:tcPr>
+            <w:tcW w:type="dxa" w:w="1520"/>
+          </w:tcPr>
+          <w:p>
+            <w:pPr>
+              <w:jc w:val="center"/>
+            </w:pPr>
+            <w:r/>
+            <w:r>
+              <w:rPr>
+                <w:sz w:val="20"/>
+              </w:rPr>
+              <w:t>TBD</w:t>
+            </w:r>
+          </w:p>
+        </w:tc>
+      </w:tr>
+    </w:tbl>
+    <w:p>
+      <w:pPr>
+        <w:jc w:val="center"/>
+      </w:pPr>
+      <w:r>
+        <w:rPr>
+          <w:i/>
+          <w:sz w:val="18"/>
+        </w:rPr>
+        <w:t>Tabel 2. Hasil load test T1 vs T2 per level user (placeholder)</w:t>
+      </w:r>
+    </w:p>
+    <w:p>
+      <w:pPr>
+        <w:pStyle w:val="Heading2"/>
+      </w:pPr>
+      <w:r>
+        <w:rPr>
+          <w:color w:val="1F4E79"/>
+        </w:rPr>
+        <w:t>3.4 Perhitungan Speedup</w:t>
+      </w:r>
+    </w:p>
+    <w:p>
+      <w:r>
+        <w:rPr>
+          <w:b w:val="0"/>
+          <w:i/>
+        </w:rPr>
+        <w:t>Speedup = (throughput T2)/(throughput T1) dihitung per level user dan per ukuran file (TBD).</w:t>
+      </w:r>
+    </w:p>
     <w:tbl>
       <w:tblPr>
         <w:tblStyle w:val="LightGrid-Accent1"/>
@@ -1114,7 +1659,7 @@
                 <w:color w:val="FFFFFF"/>
                 <w:sz w:val="20"/>
               </w:rPr>
-              <w:t>Skenario</w:t>
+              <w:t>File</w:t>
             </w:r>
           </w:p>
         </w:tc>
@@ -1134,7 +1679,7 @@
                 <w:color w:val="FFFFFF"/>
                 <w:sz w:val="20"/>
               </w:rPr>
-              <w:t>p90 (ms)</w:t>
+              <w:t>Judul kolom</w:t>
             </w:r>
           </w:p>
         </w:tc>
@@ -1154,7 +1699,7 @@
                 <w:color w:val="FFFFFF"/>
                 <w:sz w:val="20"/>
               </w:rPr>
-              <w:t>p95 (ms)</w:t>
+              <w:t>T1 (1 node) req/s</w:t>
             </w:r>
           </w:p>
         </w:tc>
@@ -1174,1012 +1719,13 @@
                 <w:color w:val="FFFFFF"/>
                 <w:sz w:val="20"/>
               </w:rPr>
-              <w:t>Throughput (req/s)</w:t>
+              <w:t>T2 (3 node+LB) req/s</w:t>
             </w:r>
           </w:p>
         </w:tc>
         <w:tc>
           <w:tcPr>
             <w:tcW w:type="dxa" w:w="1824"/>
-            <w:shd w:val="clear" w:color="auto" w:fill="1F4E79"/>
-          </w:tcPr>
-          <w:p>
-            <w:pPr>
-              <w:jc w:val="center"/>
-            </w:pPr>
-            <w:r/>
-            <w:r>
-              <w:rPr>
-                <w:b/>
-                <w:color w:val="FFFFFF"/>
-                <w:sz w:val="20"/>
-              </w:rPr>
-              <w:t>Total Request</w:t>
-            </w:r>
-          </w:p>
-        </w:tc>
-      </w:tr>
-      <w:tr>
-        <w:tc>
-          <w:tcPr>
-            <w:tcW w:type="dxa" w:w="1824"/>
-          </w:tcPr>
-          <w:p>
-            <w:pPr>
-              <w:jc w:val="center"/>
-            </w:pPr>
-            <w:r/>
-            <w:r>
-              <w:rPr>
-                <w:b/>
-                <w:sz w:val="20"/>
-              </w:rPr>
-              <w:t>T1 1kb (1 node)</w:t>
-            </w:r>
-          </w:p>
-        </w:tc>
-        <w:tc>
-          <w:tcPr>
-            <w:tcW w:type="dxa" w:w="1824"/>
-          </w:tcPr>
-          <w:p>
-            <w:pPr>
-              <w:jc w:val="center"/>
-            </w:pPr>
-            <w:r/>
-            <w:r>
-              <w:rPr>
-                <w:sz w:val="20"/>
-              </w:rPr>
-              <w:t>62.57</w:t>
-            </w:r>
-          </w:p>
-        </w:tc>
-        <w:tc>
-          <w:tcPr>
-            <w:tcW w:type="dxa" w:w="1824"/>
-          </w:tcPr>
-          <w:p>
-            <w:pPr>
-              <w:jc w:val="center"/>
-            </w:pPr>
-            <w:r/>
-            <w:r>
-              <w:rPr>
-                <w:sz w:val="20"/>
-              </w:rPr>
-              <w:t>67.24</w:t>
-            </w:r>
-          </w:p>
-        </w:tc>
-        <w:tc>
-          <w:tcPr>
-            <w:tcW w:type="dxa" w:w="1824"/>
-          </w:tcPr>
-          <w:p>
-            <w:pPr>
-              <w:jc w:val="center"/>
-            </w:pPr>
-            <w:r/>
-            <w:r>
-              <w:rPr>
-                <w:sz w:val="20"/>
-              </w:rPr>
-              <w:t>2,664.21</w:t>
-            </w:r>
-          </w:p>
-        </w:tc>
-        <w:tc>
-          <w:tcPr>
-            <w:tcW w:type="dxa" w:w="1824"/>
-          </w:tcPr>
-          <w:p>
-            <w:pPr>
-              <w:jc w:val="center"/>
-            </w:pPr>
-            <w:r/>
-            <w:r>
-              <w:rPr>
-                <w:sz w:val="20"/>
-              </w:rPr>
-              <w:t>239,780</w:t>
-            </w:r>
-          </w:p>
-        </w:tc>
-      </w:tr>
-      <w:tr>
-        <w:tc>
-          <w:tcPr>
-            <w:tcW w:type="dxa" w:w="1824"/>
-          </w:tcPr>
-          <w:p>
-            <w:pPr>
-              <w:jc w:val="center"/>
-            </w:pPr>
-            <w:r/>
-            <w:r>
-              <w:rPr>
-                <w:b/>
-                <w:sz w:val="20"/>
-              </w:rPr>
-              <w:t>T2 1kb (3 node+LB)</w:t>
-            </w:r>
-          </w:p>
-        </w:tc>
-        <w:tc>
-          <w:tcPr>
-            <w:tcW w:type="dxa" w:w="1824"/>
-          </w:tcPr>
-          <w:p>
-            <w:pPr>
-              <w:jc w:val="center"/>
-            </w:pPr>
-            <w:r/>
-            <w:r>
-              <w:rPr>
-                <w:sz w:val="20"/>
-              </w:rPr>
-              <w:t>58.59</w:t>
-            </w:r>
-          </w:p>
-        </w:tc>
-        <w:tc>
-          <w:tcPr>
-            <w:tcW w:type="dxa" w:w="1824"/>
-          </w:tcPr>
-          <w:p>
-            <w:pPr>
-              <w:jc w:val="center"/>
-            </w:pPr>
-            <w:r/>
-            <w:r>
-              <w:rPr>
-                <w:sz w:val="20"/>
-              </w:rPr>
-              <w:t>73.35</w:t>
-            </w:r>
-          </w:p>
-        </w:tc>
-        <w:tc>
-          <w:tcPr>
-            <w:tcW w:type="dxa" w:w="1824"/>
-          </w:tcPr>
-          <w:p>
-            <w:pPr>
-              <w:jc w:val="center"/>
-            </w:pPr>
-            <w:r/>
-            <w:r>
-              <w:rPr>
-                <w:sz w:val="20"/>
-              </w:rPr>
-              <w:t>3,008.13</w:t>
-            </w:r>
-          </w:p>
-        </w:tc>
-        <w:tc>
-          <w:tcPr>
-            <w:tcW w:type="dxa" w:w="1824"/>
-          </w:tcPr>
-          <w:p>
-            <w:pPr>
-              <w:jc w:val="center"/>
-            </w:pPr>
-            <w:r/>
-            <w:r>
-              <w:rPr>
-                <w:sz w:val="20"/>
-              </w:rPr>
-              <w:t>270,735</w:t>
-            </w:r>
-          </w:p>
-        </w:tc>
-      </w:tr>
-      <w:tr>
-        <w:tc>
-          <w:tcPr>
-            <w:tcW w:type="dxa" w:w="1824"/>
-          </w:tcPr>
-          <w:p>
-            <w:pPr>
-              <w:jc w:val="center"/>
-            </w:pPr>
-            <w:r/>
-            <w:r>
-              <w:rPr>
-                <w:b/>
-                <w:sz w:val="20"/>
-              </w:rPr>
-              <w:t>T1 10kb (1 node)</w:t>
-            </w:r>
-          </w:p>
-        </w:tc>
-        <w:tc>
-          <w:tcPr>
-            <w:tcW w:type="dxa" w:w="1824"/>
-          </w:tcPr>
-          <w:p>
-            <w:pPr>
-              <w:jc w:val="center"/>
-            </w:pPr>
-            <w:r/>
-            <w:r>
-              <w:rPr>
-                <w:sz w:val="20"/>
-              </w:rPr>
-              <w:t>73.60</w:t>
-            </w:r>
-          </w:p>
-        </w:tc>
-        <w:tc>
-          <w:tcPr>
-            <w:tcW w:type="dxa" w:w="1824"/>
-          </w:tcPr>
-          <w:p>
-            <w:pPr>
-              <w:jc w:val="center"/>
-            </w:pPr>
-            <w:r/>
-            <w:r>
-              <w:rPr>
-                <w:sz w:val="20"/>
-              </w:rPr>
-              <w:t>89.63</w:t>
-            </w:r>
-          </w:p>
-        </w:tc>
-        <w:tc>
-          <w:tcPr>
-            <w:tcW w:type="dxa" w:w="1824"/>
-          </w:tcPr>
-          <w:p>
-            <w:pPr>
-              <w:jc w:val="center"/>
-            </w:pPr>
-            <w:r/>
-            <w:r>
-              <w:rPr>
-                <w:sz w:val="20"/>
-              </w:rPr>
-              <w:t>2,364.32</w:t>
-            </w:r>
-          </w:p>
-        </w:tc>
-        <w:tc>
-          <w:tcPr>
-            <w:tcW w:type="dxa" w:w="1824"/>
-          </w:tcPr>
-          <w:p>
-            <w:pPr>
-              <w:jc w:val="center"/>
-            </w:pPr>
-            <w:r/>
-            <w:r>
-              <w:rPr>
-                <w:sz w:val="20"/>
-              </w:rPr>
-              <w:t>212,792</w:t>
-            </w:r>
-          </w:p>
-        </w:tc>
-      </w:tr>
-      <w:tr>
-        <w:tc>
-          <w:tcPr>
-            <w:tcW w:type="dxa" w:w="1824"/>
-          </w:tcPr>
-          <w:p>
-            <w:pPr>
-              <w:jc w:val="center"/>
-            </w:pPr>
-            <w:r/>
-            <w:r>
-              <w:rPr>
-                <w:b/>
-                <w:sz w:val="20"/>
-              </w:rPr>
-              <w:t>T2 10kb (3 node+LB)</w:t>
-            </w:r>
-          </w:p>
-        </w:tc>
-        <w:tc>
-          <w:tcPr>
-            <w:tcW w:type="dxa" w:w="1824"/>
-          </w:tcPr>
-          <w:p>
-            <w:pPr>
-              <w:jc w:val="center"/>
-            </w:pPr>
-            <w:r/>
-            <w:r>
-              <w:rPr>
-                <w:sz w:val="20"/>
-              </w:rPr>
-              <w:t>65.09</w:t>
-            </w:r>
-          </w:p>
-        </w:tc>
-        <w:tc>
-          <w:tcPr>
-            <w:tcW w:type="dxa" w:w="1824"/>
-          </w:tcPr>
-          <w:p>
-            <w:pPr>
-              <w:jc w:val="center"/>
-            </w:pPr>
-            <w:r/>
-            <w:r>
-              <w:rPr>
-                <w:sz w:val="20"/>
-              </w:rPr>
-              <w:t>76.29</w:t>
-            </w:r>
-          </w:p>
-        </w:tc>
-        <w:tc>
-          <w:tcPr>
-            <w:tcW w:type="dxa" w:w="1824"/>
-          </w:tcPr>
-          <w:p>
-            <w:pPr>
-              <w:jc w:val="center"/>
-            </w:pPr>
-            <w:r/>
-            <w:r>
-              <w:rPr>
-                <w:sz w:val="20"/>
-              </w:rPr>
-              <w:t>2,704.45</w:t>
-            </w:r>
-          </w:p>
-        </w:tc>
-        <w:tc>
-          <w:tcPr>
-            <w:tcW w:type="dxa" w:w="1824"/>
-          </w:tcPr>
-          <w:p>
-            <w:pPr>
-              <w:jc w:val="center"/>
-            </w:pPr>
-            <w:r/>
-            <w:r>
-              <w:rPr>
-                <w:sz w:val="20"/>
-              </w:rPr>
-              <w:t>243,401</w:t>
-            </w:r>
-          </w:p>
-        </w:tc>
-      </w:tr>
-      <w:tr>
-        <w:tc>
-          <w:tcPr>
-            <w:tcW w:type="dxa" w:w="1824"/>
-          </w:tcPr>
-          <w:p>
-            <w:pPr>
-              <w:jc w:val="center"/>
-            </w:pPr>
-            <w:r/>
-            <w:r>
-              <w:rPr>
-                <w:b/>
-                <w:sz w:val="20"/>
-              </w:rPr>
-              <w:t>T1 100kb (1 node)</w:t>
-            </w:r>
-          </w:p>
-        </w:tc>
-        <w:tc>
-          <w:tcPr>
-            <w:tcW w:type="dxa" w:w="1824"/>
-          </w:tcPr>
-          <w:p>
-            <w:pPr>
-              <w:jc w:val="center"/>
-            </w:pPr>
-            <w:r/>
-            <w:r>
-              <w:rPr>
-                <w:sz w:val="20"/>
-              </w:rPr>
-              <w:t>171.83</w:t>
-            </w:r>
-          </w:p>
-        </w:tc>
-        <w:tc>
-          <w:tcPr>
-            <w:tcW w:type="dxa" w:w="1824"/>
-          </w:tcPr>
-          <w:p>
-            <w:pPr>
-              <w:jc w:val="center"/>
-            </w:pPr>
-            <w:r/>
-            <w:r>
-              <w:rPr>
-                <w:sz w:val="20"/>
-              </w:rPr>
-              <w:t>188.95</w:t>
-            </w:r>
-          </w:p>
-        </w:tc>
-        <w:tc>
-          <w:tcPr>
-            <w:tcW w:type="dxa" w:w="1824"/>
-          </w:tcPr>
-          <w:p>
-            <w:pPr>
-              <w:jc w:val="center"/>
-            </w:pPr>
-            <w:r/>
-            <w:r>
-              <w:rPr>
-                <w:sz w:val="20"/>
-              </w:rPr>
-              <w:t>1,031.11</w:t>
-            </w:r>
-          </w:p>
-        </w:tc>
-        <w:tc>
-          <w:tcPr>
-            <w:tcW w:type="dxa" w:w="1824"/>
-          </w:tcPr>
-          <w:p>
-            <w:pPr>
-              <w:jc w:val="center"/>
-            </w:pPr>
-            <w:r/>
-            <w:r>
-              <w:rPr>
-                <w:sz w:val="20"/>
-              </w:rPr>
-              <w:t>92,804</w:t>
-            </w:r>
-          </w:p>
-        </w:tc>
-      </w:tr>
-      <w:tr>
-        <w:tc>
-          <w:tcPr>
-            <w:tcW w:type="dxa" w:w="1824"/>
-          </w:tcPr>
-          <w:p>
-            <w:pPr>
-              <w:jc w:val="center"/>
-            </w:pPr>
-            <w:r/>
-            <w:r>
-              <w:rPr>
-                <w:b/>
-                <w:sz w:val="20"/>
-              </w:rPr>
-              <w:t>T2 100kb (3 node+LB)</w:t>
-            </w:r>
-          </w:p>
-        </w:tc>
-        <w:tc>
-          <w:tcPr>
-            <w:tcW w:type="dxa" w:w="1824"/>
-          </w:tcPr>
-          <w:p>
-            <w:pPr>
-              <w:jc w:val="center"/>
-            </w:pPr>
-            <w:r/>
-            <w:r>
-              <w:rPr>
-                <w:sz w:val="20"/>
-              </w:rPr>
-              <w:t>212.10</w:t>
-            </w:r>
-          </w:p>
-        </w:tc>
-        <w:tc>
-          <w:tcPr>
-            <w:tcW w:type="dxa" w:w="1824"/>
-          </w:tcPr>
-          <w:p>
-            <w:pPr>
-              <w:jc w:val="center"/>
-            </w:pPr>
-            <w:r/>
-            <w:r>
-              <w:rPr>
-                <w:sz w:val="20"/>
-              </w:rPr>
-              <w:t>244.54</w:t>
-            </w:r>
-          </w:p>
-        </w:tc>
-        <w:tc>
-          <w:tcPr>
-            <w:tcW w:type="dxa" w:w="1824"/>
-          </w:tcPr>
-          <w:p>
-            <w:pPr>
-              <w:jc w:val="center"/>
-            </w:pPr>
-            <w:r/>
-            <w:r>
-              <w:rPr>
-                <w:sz w:val="20"/>
-              </w:rPr>
-              <w:t>859.87</w:t>
-            </w:r>
-          </w:p>
-        </w:tc>
-        <w:tc>
-          <w:tcPr>
-            <w:tcW w:type="dxa" w:w="1824"/>
-          </w:tcPr>
-          <w:p>
-            <w:pPr>
-              <w:jc w:val="center"/>
-            </w:pPr>
-            <w:r/>
-            <w:r>
-              <w:rPr>
-                <w:sz w:val="20"/>
-              </w:rPr>
-              <w:t>77,391</w:t>
-            </w:r>
-          </w:p>
-        </w:tc>
-      </w:tr>
-      <w:tr>
-        <w:tc>
-          <w:tcPr>
-            <w:tcW w:type="dxa" w:w="1824"/>
-          </w:tcPr>
-          <w:p>
-            <w:pPr>
-              <w:jc w:val="center"/>
-            </w:pPr>
-            <w:r/>
-            <w:r>
-              <w:rPr>
-                <w:b/>
-                <w:sz w:val="20"/>
-              </w:rPr>
-              <w:t>T1 1MB (1 node)</w:t>
-            </w:r>
-          </w:p>
-        </w:tc>
-        <w:tc>
-          <w:tcPr>
-            <w:tcW w:type="dxa" w:w="1824"/>
-          </w:tcPr>
-          <w:p>
-            <w:pPr>
-              <w:jc w:val="center"/>
-            </w:pPr>
-            <w:r/>
-            <w:r>
-              <w:rPr>
-                <w:sz w:val="20"/>
-              </w:rPr>
-              <w:t>1,375.75</w:t>
-            </w:r>
-          </w:p>
-        </w:tc>
-        <w:tc>
-          <w:tcPr>
-            <w:tcW w:type="dxa" w:w="1824"/>
-          </w:tcPr>
-          <w:p>
-            <w:pPr>
-              <w:jc w:val="center"/>
-            </w:pPr>
-            <w:r/>
-            <w:r>
-              <w:rPr>
-                <w:sz w:val="20"/>
-              </w:rPr>
-              <w:t>1,510.97</w:t>
-            </w:r>
-          </w:p>
-        </w:tc>
-        <w:tc>
-          <w:tcPr>
-            <w:tcW w:type="dxa" w:w="1824"/>
-          </w:tcPr>
-          <w:p>
-            <w:pPr>
-              <w:jc w:val="center"/>
-            </w:pPr>
-            <w:r/>
-            <w:r>
-              <w:rPr>
-                <w:sz w:val="20"/>
-              </w:rPr>
-              <w:t>131.85</w:t>
-            </w:r>
-          </w:p>
-        </w:tc>
-        <w:tc>
-          <w:tcPr>
-            <w:tcW w:type="dxa" w:w="1824"/>
-          </w:tcPr>
-          <w:p>
-            <w:pPr>
-              <w:jc w:val="center"/>
-            </w:pPr>
-            <w:r/>
-            <w:r>
-              <w:rPr>
-                <w:sz w:val="20"/>
-              </w:rPr>
-              <w:t>11,868</w:t>
-            </w:r>
-          </w:p>
-        </w:tc>
-      </w:tr>
-      <w:tr>
-        <w:tc>
-          <w:tcPr>
-            <w:tcW w:type="dxa" w:w="1824"/>
-          </w:tcPr>
-          <w:p>
-            <w:pPr>
-              <w:jc w:val="center"/>
-            </w:pPr>
-            <w:r/>
-            <w:r>
-              <w:rPr>
-                <w:b/>
-                <w:sz w:val="20"/>
-              </w:rPr>
-              <w:t>T2 1MB (3 node+LB)</w:t>
-            </w:r>
-          </w:p>
-        </w:tc>
-        <w:tc>
-          <w:tcPr>
-            <w:tcW w:type="dxa" w:w="1824"/>
-          </w:tcPr>
-          <w:p>
-            <w:pPr>
-              <w:jc w:val="center"/>
-            </w:pPr>
-            <w:r/>
-            <w:r>
-              <w:rPr>
-                <w:sz w:val="20"/>
-              </w:rPr>
-              <w:t>1,296.89</w:t>
-            </w:r>
-          </w:p>
-        </w:tc>
-        <w:tc>
-          <w:tcPr>
-            <w:tcW w:type="dxa" w:w="1824"/>
-          </w:tcPr>
-          <w:p>
-            <w:pPr>
-              <w:jc w:val="center"/>
-            </w:pPr>
-            <w:r/>
-            <w:r>
-              <w:rPr>
-                <w:sz w:val="20"/>
-              </w:rPr>
-              <w:t>1,411.16</w:t>
-            </w:r>
-          </w:p>
-        </w:tc>
-        <w:tc>
-          <w:tcPr>
-            <w:tcW w:type="dxa" w:w="1824"/>
-          </w:tcPr>
-          <w:p>
-            <w:pPr>
-              <w:jc w:val="center"/>
-            </w:pPr>
-            <w:r/>
-            <w:r>
-              <w:rPr>
-                <w:sz w:val="20"/>
-              </w:rPr>
-              <w:t>130.65</w:t>
-            </w:r>
-          </w:p>
-        </w:tc>
-        <w:tc>
-          <w:tcPr>
-            <w:tcW w:type="dxa" w:w="1824"/>
-          </w:tcPr>
-          <w:p>
-            <w:pPr>
-              <w:jc w:val="center"/>
-            </w:pPr>
-            <w:r/>
-            <w:r>
-              <w:rPr>
-                <w:sz w:val="20"/>
-              </w:rPr>
-              <w:t>11,760</w:t>
-            </w:r>
-          </w:p>
-        </w:tc>
-      </w:tr>
-      <w:tr>
-        <w:tc>
-          <w:tcPr>
-            <w:tcW w:type="dxa" w:w="1824"/>
-          </w:tcPr>
-          <w:p>
-            <w:pPr>
-              <w:jc w:val="center"/>
-            </w:pPr>
-            <w:r/>
-            <w:r>
-              <w:rPr>
-                <w:b/>
-                <w:sz w:val="20"/>
-              </w:rPr>
-              <w:t>T1 10MB (1 node)</w:t>
-            </w:r>
-          </w:p>
-        </w:tc>
-        <w:tc>
-          <w:tcPr>
-            <w:tcW w:type="dxa" w:w="1824"/>
-          </w:tcPr>
-          <w:p>
-            <w:pPr>
-              <w:jc w:val="center"/>
-            </w:pPr>
-            <w:r/>
-            <w:r>
-              <w:rPr>
-                <w:sz w:val="20"/>
-              </w:rPr>
-              <w:t>15,439.96</w:t>
-            </w:r>
-          </w:p>
-        </w:tc>
-        <w:tc>
-          <w:tcPr>
-            <w:tcW w:type="dxa" w:w="1824"/>
-          </w:tcPr>
-          <w:p>
-            <w:pPr>
-              <w:jc w:val="center"/>
-            </w:pPr>
-            <w:r/>
-            <w:r>
-              <w:rPr>
-                <w:sz w:val="20"/>
-              </w:rPr>
-              <w:t>15,955.10</w:t>
-            </w:r>
-          </w:p>
-        </w:tc>
-        <w:tc>
-          <w:tcPr>
-            <w:tcW w:type="dxa" w:w="1824"/>
-          </w:tcPr>
-          <w:p>
-            <w:pPr>
-              <w:jc w:val="center"/>
-            </w:pPr>
-            <w:r/>
-            <w:r>
-              <w:rPr>
-                <w:sz w:val="20"/>
-              </w:rPr>
-              <w:t>11.32</w:t>
-            </w:r>
-          </w:p>
-        </w:tc>
-        <w:tc>
-          <w:tcPr>
-            <w:tcW w:type="dxa" w:w="1824"/>
-          </w:tcPr>
-          <w:p>
-            <w:pPr>
-              <w:jc w:val="center"/>
-            </w:pPr>
-            <w:r/>
-            <w:r>
-              <w:rPr>
-                <w:sz w:val="20"/>
-              </w:rPr>
-              <w:t>1,040</w:t>
-            </w:r>
-          </w:p>
-        </w:tc>
-      </w:tr>
-      <w:tr>
-        <w:tc>
-          <w:tcPr>
-            <w:tcW w:type="dxa" w:w="1824"/>
-          </w:tcPr>
-          <w:p>
-            <w:pPr>
-              <w:jc w:val="center"/>
-            </w:pPr>
-            <w:r/>
-            <w:r>
-              <w:rPr>
-                <w:b/>
-                <w:sz w:val="20"/>
-              </w:rPr>
-              <w:t>T2 10MB (3 node+LB)</w:t>
-            </w:r>
-          </w:p>
-        </w:tc>
-        <w:tc>
-          <w:tcPr>
-            <w:tcW w:type="dxa" w:w="1824"/>
-          </w:tcPr>
-          <w:p>
-            <w:pPr>
-              <w:jc w:val="center"/>
-            </w:pPr>
-            <w:r/>
-            <w:r>
-              <w:rPr>
-                <w:sz w:val="20"/>
-              </w:rPr>
-              <w:t>15,697.83</w:t>
-            </w:r>
-          </w:p>
-        </w:tc>
-        <w:tc>
-          <w:tcPr>
-            <w:tcW w:type="dxa" w:w="1824"/>
-          </w:tcPr>
-          <w:p>
-            <w:pPr>
-              <w:jc w:val="center"/>
-            </w:pPr>
-            <w:r/>
-            <w:r>
-              <w:rPr>
-                <w:sz w:val="20"/>
-              </w:rPr>
-              <w:t>16,335.40</w:t>
-            </w:r>
-          </w:p>
-        </w:tc>
-        <w:tc>
-          <w:tcPr>
-            <w:tcW w:type="dxa" w:w="1824"/>
-          </w:tcPr>
-          <w:p>
-            <w:pPr>
-              <w:jc w:val="center"/>
-            </w:pPr>
-            <w:r/>
-            <w:r>
-              <w:rPr>
-                <w:sz w:val="20"/>
-              </w:rPr>
-              <w:t>11.94</w:t>
-            </w:r>
-          </w:p>
-        </w:tc>
-        <w:tc>
-          <w:tcPr>
-            <w:tcW w:type="dxa" w:w="1824"/>
-          </w:tcPr>
-          <w:p>
-            <w:pPr>
-              <w:jc w:val="center"/>
-            </w:pPr>
-            <w:r/>
-            <w:r>
-              <w:rPr>
-                <w:sz w:val="20"/>
-              </w:rPr>
-              <w:t>1,093</w:t>
-            </w:r>
-          </w:p>
-        </w:tc>
-      </w:tr>
-    </w:tbl>
-    <w:p>
-      <w:pPr>
-        <w:jc w:val="center"/>
-      </w:pPr>
-      <w:r>
-        <w:rPr>
-          <w:i/>
-          <w:sz w:val="18"/>
-        </w:rPr>
-        <w:t>Tabel 2. Hasil load test T1 vs T2 (error rate 0%)</w:t>
-      </w:r>
-    </w:p>
-    <w:p>
-      <w:pPr>
-        <w:pStyle w:val="Heading2"/>
-      </w:pPr>
-      <w:r>
-        <w:rPr>
-          <w:color w:val="1F4E79"/>
-        </w:rPr>
-        <w:t>3.4 Perhitungan Speedup</w:t>
-      </w:r>
-    </w:p>
-    <w:tbl>
-      <w:tblPr>
-        <w:tblStyle w:val="LightGrid-Accent1"/>
-        <w:tblW w:type="auto" w:w="0"/>
-        <w:jc w:val="center"/>
-        <w:tblLook w:firstColumn="1" w:firstRow="1" w:lastColumn="0" w:lastRow="0" w:noHBand="0" w:noVBand="1" w:val="04A0"/>
-      </w:tblPr>
-      <w:tblGrid>
-        <w:gridCol w:w="2280"/>
-        <w:gridCol w:w="2280"/>
-        <w:gridCol w:w="2280"/>
-        <w:gridCol w:w="2280"/>
-      </w:tblGrid>
-      <w:tr>
-        <w:tc>
-          <w:tcPr>
-            <w:tcW w:type="dxa" w:w="2280"/>
-            <w:shd w:val="clear" w:color="auto" w:fill="1F4E79"/>
-          </w:tcPr>
-          <w:p>
-            <w:pPr>
-              <w:jc w:val="center"/>
-            </w:pPr>
-            <w:r/>
-            <w:r>
-              <w:rPr>
-                <w:b/>
-                <w:color w:val="FFFFFF"/>
-                <w:sz w:val="20"/>
-              </w:rPr>
-              <w:t>File</w:t>
-            </w:r>
-          </w:p>
-        </w:tc>
-        <w:tc>
-          <w:tcPr>
-            <w:tcW w:type="dxa" w:w="2280"/>
-            <w:shd w:val="clear" w:color="auto" w:fill="1F4E79"/>
-          </w:tcPr>
-          <w:p>
-            <w:pPr>
-              <w:jc w:val="center"/>
-            </w:pPr>
-            <w:r/>
-            <w:r>
-              <w:rPr>
-                <w:b/>
-                <w:color w:val="FFFFFF"/>
-                <w:sz w:val="20"/>
-              </w:rPr>
-              <w:t>T1 (1 node) req/s</w:t>
-            </w:r>
-          </w:p>
-        </w:tc>
-        <w:tc>
-          <w:tcPr>
-            <w:tcW w:type="dxa" w:w="2280"/>
-            <w:shd w:val="clear" w:color="auto" w:fill="1F4E79"/>
-          </w:tcPr>
-          <w:p>
-            <w:pPr>
-              <w:jc w:val="center"/>
-            </w:pPr>
-            <w:r/>
-            <w:r>
-              <w:rPr>
-                <w:b/>
-                <w:color w:val="FFFFFF"/>
-                <w:sz w:val="20"/>
-              </w:rPr>
-              <w:t>T2 (3 node+LB) req/s</w:t>
-            </w:r>
-          </w:p>
-        </w:tc>
-        <w:tc>
-          <w:tcPr>
-            <w:tcW w:type="dxa" w:w="2280"/>
             <w:shd w:val="clear" w:color="auto" w:fill="1F4E79"/>
           </w:tcPr>
           <w:p>
@@ -2201,7 +1747,7 @@
       <w:tr>
         <w:tc>
           <w:tcPr>
-            <w:tcW w:type="dxa" w:w="2280"/>
+            <w:tcW w:type="dxa" w:w="1824"/>
           </w:tcPr>
           <w:p>
             <w:pPr>
@@ -2219,7 +1765,7 @@
         </w:tc>
         <w:tc>
           <w:tcPr>
-            <w:tcW w:type="dxa" w:w="2280"/>
+            <w:tcW w:type="dxa" w:w="1824"/>
           </w:tcPr>
           <w:p>
             <w:pPr>
@@ -2230,13 +1776,13 @@
               <w:rPr>
                 <w:sz w:val="20"/>
               </w:rPr>
-              <w:t>2,664.21</w:t>
+              <w:t>level user →</w:t>
             </w:r>
           </w:p>
         </w:tc>
         <w:tc>
           <w:tcPr>
-            <w:tcW w:type="dxa" w:w="2280"/>
+            <w:tcW w:type="dxa" w:w="1824"/>
           </w:tcPr>
           <w:p>
             <w:pPr>
@@ -2247,13 +1793,13 @@
               <w:rPr>
                 <w:sz w:val="20"/>
               </w:rPr>
-              <w:t>3,008.13</w:t>
+              <w:t>TBD</w:t>
             </w:r>
           </w:p>
         </w:tc>
         <w:tc>
           <w:tcPr>
-            <w:tcW w:type="dxa" w:w="2280"/>
+            <w:tcW w:type="dxa" w:w="1824"/>
           </w:tcPr>
           <w:p>
             <w:pPr>
@@ -2264,7 +1810,24 @@
               <w:rPr>
                 <w:sz w:val="20"/>
               </w:rPr>
-              <w:t>1.13x</w:t>
+              <w:t>TBD</w:t>
+            </w:r>
+          </w:p>
+        </w:tc>
+        <w:tc>
+          <w:tcPr>
+            <w:tcW w:type="dxa" w:w="1824"/>
+          </w:tcPr>
+          <w:p>
+            <w:pPr>
+              <w:jc w:val="center"/>
+            </w:pPr>
+            <w:r/>
+            <w:r>
+              <w:rPr>
+                <w:sz w:val="20"/>
+              </w:rPr>
+              <w:t>TBD</w:t>
             </w:r>
           </w:p>
         </w:tc>
@@ -2272,7 +1835,7 @@
       <w:tr>
         <w:tc>
           <w:tcPr>
-            <w:tcW w:type="dxa" w:w="2280"/>
+            <w:tcW w:type="dxa" w:w="1824"/>
           </w:tcPr>
           <w:p>
             <w:pPr>
@@ -2290,7 +1853,7 @@
         </w:tc>
         <w:tc>
           <w:tcPr>
-            <w:tcW w:type="dxa" w:w="2280"/>
+            <w:tcW w:type="dxa" w:w="1824"/>
           </w:tcPr>
           <w:p>
             <w:pPr>
@@ -2301,13 +1864,13 @@
               <w:rPr>
                 <w:sz w:val="20"/>
               </w:rPr>
-              <w:t>2,364.32</w:t>
+              <w:t>level user →</w:t>
             </w:r>
           </w:p>
         </w:tc>
         <w:tc>
           <w:tcPr>
-            <w:tcW w:type="dxa" w:w="2280"/>
+            <w:tcW w:type="dxa" w:w="1824"/>
           </w:tcPr>
           <w:p>
             <w:pPr>
@@ -2318,13 +1881,13 @@
               <w:rPr>
                 <w:sz w:val="20"/>
               </w:rPr>
-              <w:t>2,704.45</w:t>
+              <w:t>TBD</w:t>
             </w:r>
           </w:p>
         </w:tc>
         <w:tc>
           <w:tcPr>
-            <w:tcW w:type="dxa" w:w="2280"/>
+            <w:tcW w:type="dxa" w:w="1824"/>
           </w:tcPr>
           <w:p>
             <w:pPr>
@@ -2335,7 +1898,24 @@
               <w:rPr>
                 <w:sz w:val="20"/>
               </w:rPr>
-              <w:t>1.14x</w:t>
+              <w:t>TBD</w:t>
+            </w:r>
+          </w:p>
+        </w:tc>
+        <w:tc>
+          <w:tcPr>
+            <w:tcW w:type="dxa" w:w="1824"/>
+          </w:tcPr>
+          <w:p>
+            <w:pPr>
+              <w:jc w:val="center"/>
+            </w:pPr>
+            <w:r/>
+            <w:r>
+              <w:rPr>
+                <w:sz w:val="20"/>
+              </w:rPr>
+              <w:t>TBD</w:t>
             </w:r>
           </w:p>
         </w:tc>
@@ -2343,7 +1923,7 @@
       <w:tr>
         <w:tc>
           <w:tcPr>
-            <w:tcW w:type="dxa" w:w="2280"/>
+            <w:tcW w:type="dxa" w:w="1824"/>
           </w:tcPr>
           <w:p>
             <w:pPr>
@@ -2361,7 +1941,7 @@
         </w:tc>
         <w:tc>
           <w:tcPr>
-            <w:tcW w:type="dxa" w:w="2280"/>
+            <w:tcW w:type="dxa" w:w="1824"/>
           </w:tcPr>
           <w:p>
             <w:pPr>
@@ -2372,13 +1952,13 @@
               <w:rPr>
                 <w:sz w:val="20"/>
               </w:rPr>
-              <w:t>1,031.11</w:t>
+              <w:t>level user →</w:t>
             </w:r>
           </w:p>
         </w:tc>
         <w:tc>
           <w:tcPr>
-            <w:tcW w:type="dxa" w:w="2280"/>
+            <w:tcW w:type="dxa" w:w="1824"/>
           </w:tcPr>
           <w:p>
             <w:pPr>
@@ -2389,13 +1969,13 @@
               <w:rPr>
                 <w:sz w:val="20"/>
               </w:rPr>
-              <w:t>859.87</w:t>
+              <w:t>TBD</w:t>
             </w:r>
           </w:p>
         </w:tc>
         <w:tc>
           <w:tcPr>
-            <w:tcW w:type="dxa" w:w="2280"/>
+            <w:tcW w:type="dxa" w:w="1824"/>
           </w:tcPr>
           <w:p>
             <w:pPr>
@@ -2406,7 +1986,24 @@
               <w:rPr>
                 <w:sz w:val="20"/>
               </w:rPr>
-              <w:t>0.83x</w:t>
+              <w:t>TBD</w:t>
+            </w:r>
+          </w:p>
+        </w:tc>
+        <w:tc>
+          <w:tcPr>
+            <w:tcW w:type="dxa" w:w="1824"/>
+          </w:tcPr>
+          <w:p>
+            <w:pPr>
+              <w:jc w:val="center"/>
+            </w:pPr>
+            <w:r/>
+            <w:r>
+              <w:rPr>
+                <w:sz w:val="20"/>
+              </w:rPr>
+              <w:t>TBD</w:t>
             </w:r>
           </w:p>
         </w:tc>
@@ -2414,7 +2011,7 @@
       <w:tr>
         <w:tc>
           <w:tcPr>
-            <w:tcW w:type="dxa" w:w="2280"/>
+            <w:tcW w:type="dxa" w:w="1824"/>
           </w:tcPr>
           <w:p>
             <w:pPr>
@@ -2432,7 +2029,7 @@
         </w:tc>
         <w:tc>
           <w:tcPr>
-            <w:tcW w:type="dxa" w:w="2280"/>
+            <w:tcW w:type="dxa" w:w="1824"/>
           </w:tcPr>
           <w:p>
             <w:pPr>
@@ -2443,13 +2040,13 @@
               <w:rPr>
                 <w:sz w:val="20"/>
               </w:rPr>
-              <w:t>131.85</w:t>
+              <w:t>level user →</w:t>
             </w:r>
           </w:p>
         </w:tc>
         <w:tc>
           <w:tcPr>
-            <w:tcW w:type="dxa" w:w="2280"/>
+            <w:tcW w:type="dxa" w:w="1824"/>
           </w:tcPr>
           <w:p>
             <w:pPr>
@@ -2460,13 +2057,13 @@
               <w:rPr>
                 <w:sz w:val="20"/>
               </w:rPr>
-              <w:t>130.65</w:t>
+              <w:t>TBD</w:t>
             </w:r>
           </w:p>
         </w:tc>
         <w:tc>
           <w:tcPr>
-            <w:tcW w:type="dxa" w:w="2280"/>
+            <w:tcW w:type="dxa" w:w="1824"/>
           </w:tcPr>
           <w:p>
             <w:pPr>
@@ -2477,7 +2074,24 @@
               <w:rPr>
                 <w:sz w:val="20"/>
               </w:rPr>
-              <w:t>0.99x</w:t>
+              <w:t>TBD</w:t>
+            </w:r>
+          </w:p>
+        </w:tc>
+        <w:tc>
+          <w:tcPr>
+            <w:tcW w:type="dxa" w:w="1824"/>
+          </w:tcPr>
+          <w:p>
+            <w:pPr>
+              <w:jc w:val="center"/>
+            </w:pPr>
+            <w:r/>
+            <w:r>
+              <w:rPr>
+                <w:sz w:val="20"/>
+              </w:rPr>
+              <w:t>TBD</w:t>
             </w:r>
           </w:p>
         </w:tc>
@@ -2485,7 +2099,7 @@
       <w:tr>
         <w:tc>
           <w:tcPr>
-            <w:tcW w:type="dxa" w:w="2280"/>
+            <w:tcW w:type="dxa" w:w="1824"/>
           </w:tcPr>
           <w:p>
             <w:pPr>
@@ -2503,7 +2117,7 @@
         </w:tc>
         <w:tc>
           <w:tcPr>
-            <w:tcW w:type="dxa" w:w="2280"/>
+            <w:tcW w:type="dxa" w:w="1824"/>
           </w:tcPr>
           <w:p>
             <w:pPr>
@@ -2514,13 +2128,13 @@
               <w:rPr>
                 <w:sz w:val="20"/>
               </w:rPr>
-              <w:t>11.32</w:t>
+              <w:t>level user →</w:t>
             </w:r>
           </w:p>
         </w:tc>
         <w:tc>
           <w:tcPr>
-            <w:tcW w:type="dxa" w:w="2280"/>
+            <w:tcW w:type="dxa" w:w="1824"/>
           </w:tcPr>
           <w:p>
             <w:pPr>
@@ -2531,13 +2145,13 @@
               <w:rPr>
                 <w:sz w:val="20"/>
               </w:rPr>
-              <w:t>11.94</w:t>
+              <w:t>TBD</w:t>
             </w:r>
           </w:p>
         </w:tc>
         <w:tc>
           <w:tcPr>
-            <w:tcW w:type="dxa" w:w="2280"/>
+            <w:tcW w:type="dxa" w:w="1824"/>
           </w:tcPr>
           <w:p>
             <w:pPr>
@@ -2548,7 +2162,24 @@
               <w:rPr>
                 <w:sz w:val="20"/>
               </w:rPr>
-              <w:t>1.06x</w:t>
+              <w:t>TBD</w:t>
+            </w:r>
+          </w:p>
+        </w:tc>
+        <w:tc>
+          <w:tcPr>
+            <w:tcW w:type="dxa" w:w="1824"/>
+          </w:tcPr>
+          <w:p>
+            <w:pPr>
+              <w:jc w:val="center"/>
+            </w:pPr>
+            <w:r/>
+            <w:r>
+              <w:rPr>
+                <w:sz w:val="20"/>
+              </w:rPr>
+              <w:t>TBD</w:t>
             </w:r>
           </w:p>
         </w:tc>
@@ -2563,7 +2194,7 @@
           <w:i/>
           <w:sz w:val="18"/>
         </w:rPr>
-        <w:t>Tabel 3. Speedup penambahan node 1 → 3</w:t>
+        <w:t>Tabel 3. Speedup penambahan node 1 → 3 per level user (placeholder)</w:t>
       </w:r>
     </w:p>
     <w:p>
@@ -2583,7 +2214,23 @@
           <w:b w:val="0"/>
           <w:i w:val="0"/>
         </w:rPr>
-        <w:t>Ideal (p=1) = 3x. Realita setelah tuning Nginx: 0,83x–1,14x. File kecil kini lebih cepat (+13–14%) karena 3 node memproses paralel, namun tetap jauh dari 3x. Penyebab (1-p) dominan:</w:t>
+        <w:t>Kerangka analisis (Amdahl's Law):</w:t>
+      </w:r>
+    </w:p>
+    <w:p>
+      <w:pPr>
+        <w:pStyle w:val="ListBullet"/>
+      </w:pPr>
+      <w:r>
+        <w:t>Ideal bila p=1: speedup = N = 3x pada tiap level user.</w:t>
+      </w:r>
+    </w:p>
+    <w:p>
+      <w:pPr>
+        <w:pStyle w:val="ListBullet"/>
+      </w:pPr>
+      <w:r>
+        <w:t>Realita diperkirakan mendekati 1x atau sedikit di atas — jauh dari 3x. Penyebab (1-p) dominan:</w:t>
       </w:r>
     </w:p>
     <w:p>
@@ -2611,6 +2258,15 @@
       </w:r>
     </w:p>
     <w:p>
+      <w:r>
+        <w:rPr>
+          <w:b w:val="0"/>
+          <w:i/>
+        </w:rPr>
+        <w:t>Angka kuantitatif: TBD — diisi setelah pengujian aktual.</w:t>
+      </w:r>
+    </w:p>
+    <w:p>
       <w:pPr>
         <w:pStyle w:val="Heading2"/>
       </w:pPr>
@@ -2627,7 +2283,7 @@
           <w:b w:val="0"/>
           <w:i w:val="0"/>
         </w:rPr>
-        <w:t>Amdahl's Law terbukti. Penambahan node dari 1 ke 3 memberi sedikit kecepatan pada request ringan (1.13–1.14x) namun jauh dari ideal 3x karena resource paralel di mesin fisik yang sama, workload yang tidak CPU-bound, dan komponen serial (Nginx LB) yang tetap membatasi.</w:t>
+        <w:t>Amdahl's Law akan dibuktikan jika speedup hasil pengujian jauh di bawah ideal 3x pada semua level user, karena resource paralel di mesin fisik yang sama, workload yang tidak CPU-bound, dan komponen serial (Nginx LB) yang tetap membatasi. Kesimpulan angka konkret diisi setelah tes.</w:t>
       </w:r>
     </w:p>
     <w:p>
@@ -2871,7 +2527,7 @@
               <w:rPr>
                 <w:sz w:val="20"/>
               </w:rPr>
-              <w:t>Ukuran file (beban)</w:t>
+              <w:t>Jumlah user (L) &amp; ukuran file (W)</w:t>
             </w:r>
           </w:p>
         </w:tc>
@@ -2888,7 +2544,7 @@
               <w:rPr>
                 <w:sz w:val="20"/>
               </w:rPr>
-              <w:t>Jumlah node (paralelisme)</w:t>
+              <w:t>Jumlah node (paralelisme) &amp; user</w:t>
             </w:r>
           </w:p>
         </w:tc>
@@ -2908,7 +2564,7 @@
                 <w:b/>
                 <w:sz w:val="20"/>
               </w:rPr>
-              <w:t>Hasil 1kb</w:t>
+              <w:t>Pola hasil</w:t>
             </w:r>
           </w:p>
         </w:tc>
@@ -2925,7 +2581,7 @@
               <w:rPr>
                 <w:sz w:val="20"/>
               </w:rPr>
-              <w:t>2,664 req/s</w:t>
+              <w:t>User ↑ → latency ↑ (delay)</w:t>
             </w:r>
           </w:p>
         </w:tc>
@@ -2942,61 +2598,7 @@
               <w:rPr>
                 <w:sz w:val="20"/>
               </w:rPr>
-              <w:t>3,008 req/s (↑ 13%)</w:t>
-            </w:r>
-          </w:p>
-        </w:tc>
-      </w:tr>
-      <w:tr>
-        <w:tc>
-          <w:tcPr>
-            <w:tcW w:type="dxa" w:w="3041"/>
-          </w:tcPr>
-          <w:p>
-            <w:pPr>
-              <w:jc w:val="center"/>
-            </w:pPr>
-            <w:r/>
-            <w:r>
-              <w:rPr>
-                <w:b/>
-                <w:sz w:val="20"/>
-              </w:rPr>
-              <w:t>Hasil 10MB</w:t>
-            </w:r>
-          </w:p>
-        </w:tc>
-        <w:tc>
-          <w:tcPr>
-            <w:tcW w:type="dxa" w:w="3041"/>
-          </w:tcPr>
-          <w:p>
-            <w:pPr>
-              <w:jc w:val="center"/>
-            </w:pPr>
-            <w:r/>
-            <w:r>
-              <w:rPr>
-                <w:sz w:val="20"/>
-              </w:rPr>
-              <w:t>11.32 req/s</w:t>
-            </w:r>
-          </w:p>
-        </w:tc>
-        <w:tc>
-          <w:tcPr>
-            <w:tcW w:type="dxa" w:w="3041"/>
-          </w:tcPr>
-          <w:p>
-            <w:pPr>
-              <w:jc w:val="center"/>
-            </w:pPr>
-            <w:r/>
-            <w:r>
-              <w:rPr>
-                <w:sz w:val="20"/>
-              </w:rPr>
-              <w:t>11.94 req/s (↑ 6%)</w:t>
+              <w:t>Speedup vs single node (dihitung per level user)</w:t>
             </w:r>
           </w:p>
         </w:tc>
@@ -3033,7 +2635,7 @@
               <w:rPr>
                 <w:sz w:val="20"/>
               </w:rPr>
-              <w:t>Ada batas mutlak kapasitas server</w:t>
+              <w:t>Batas mutlak kapasitas server</w:t>
             </w:r>
           </w:p>
         </w:tc>
@@ -3084,7 +2686,7 @@
         <w:pStyle w:val="ListBullet"/>
       </w:pPr>
       <w:r>
-        <w:t>Beban kecil (1kb, 10kb) + LB = manfaat nyata: node paralel menolong (1kb 2.664 → 3.008 req/s; 10kb 2.364 → 2.704 req/s).</w:t>
+        <w:t>Kedua tugas memakai basis user yang sama (200–1000), sehingga perbandingan latency pada level user yang identik bersifat adil.</w:t>
       </w:r>
     </w:p>
     <w:p>
@@ -3092,7 +2694,7 @@
         <w:pStyle w:val="ListBullet"/>
       </w:pPr>
       <w:r>
-        <w:t>Beban menengah-besar (100kb/dekat) speedup mendekati 1x atau di bawah (0.83x–1.06x): 3 node di satu mesin tidak bisa melampaui kapasitas I/O + satu pintu masuk.</w:t>
+        <w:t>Little's Law menjelaskan perilaku beban: makin banyak user → makin besar delay; file besar mempercepat jenuh.</w:t>
       </w:r>
     </w:p>
     <w:p>
@@ -3100,7 +2702,16 @@
         <w:pStyle w:val="ListBullet"/>
       </w:pPr>
       <w:r>
-        <w:t>Kedua hukum saling melengkapi: Little's Law menjelaskan batas sistem tunggal (file besar membebani), Amdahl's Law menjelaskan mengapa menambah node tidak menuju 3x (bagian serial + resource berbagi membatasi).</w:t>
+        <w:t>Amdahl's Law menjelaskan skalabilitas: menambah node tidak menuju 3x karena bagian serial + resource berbagi.</w:t>
+      </w:r>
+    </w:p>
+    <w:p>
+      <w:r>
+        <w:rPr>
+          <w:b w:val="0"/>
+          <w:i/>
+        </w:rPr>
+        <w:t>Angka kuantitatif perbandingan: TBD — diisi setelah pengujian aktual.</w:t>
       </w:r>
     </w:p>
     <w:p>
@@ -3125,7 +2736,7 @@
           <w:b w:val="0"/>
           <w:i w:val="0"/>
         </w:rPr>
-        <w:t>1. Little's Law terbukti pada sistem single node: memperbesar ukuran file menaikkan latency (W) sehingga concurrency (L) membesar dan throughput (λ) turun hingga 99,6%.</w:t>
+        <w:t>1. Little's Law akan dibuktikan pada sistem single node: bertambahnya jumlah user menaikkan latency (W) dan file besar membuat throughput (λ) turun drastis.</w:t>
       </w:r>
     </w:p>
     <w:p>
@@ -3134,7 +2745,16 @@
           <w:b w:val="0"/>
           <w:i w:val="0"/>
         </w:rPr>
-        <w:t>2. Amdahl's Law terbukti pada sistem 3 node + LB yang dituning: speedup 0,83x–1,14x — file kecil naik +13–14%, namun jauh dari 3x ideal karena bagian serial (Nginx LB) dan resource fisik yang berbagi (3 node di satu mesin), bukan kapasitas pemrosesan murni.</w:t>
+        <w:t>2. Amdahl's Law pada sistem 3 node + LB yang dituning diperkirakan memberi speedup jauh di bawah 3x ideal karena bagian serial (Nginx LB) dan resource fisik yang berbagi.</w:t>
+      </w:r>
+    </w:p>
+    <w:p>
+      <w:r>
+        <w:rPr>
+          <w:b w:val="0"/>
+          <w:i w:val="0"/>
+        </w:rPr>
+        <w:t>3. Implikasi desain: sistem yang skalabel harus memperkecil bagian serial (single entry point) terlebih dahulu sebelum menambah resource paralel.</w:t>
       </w:r>
     </w:p>
     <w:p>

</xml_diff>